<commit_message>
Hosted API on Render Starter: the free plan sleeps and the first visit hangs
Co-Authored-By: Claude Opus 5.5 <noreply@anthropic.com>
</commit_message>
<xml_diff>
--- a/docs/IntrAI agentic SaaS - processes etc.docx
+++ b/docs/IntrAI agentic SaaS - processes etc.docx
@@ -2070,7 +2070,7 @@
           </w:tcPr>
           <w:p>
             <w:r>
-              <w:t xml:space="preserve">Free</w:t>
+              <w:t xml:space="preserve">Starter (paid)</w:t>
             </w:r>
           </w:p>
         </w:tc>
@@ -2092,7 +2092,7 @@
           </w:tcPr>
           <w:p>
             <w:r>
-              <w:t xml:space="preserve">Sleeps after 15 min idle; started through </w:t>
+              <w:t xml:space="preserve">Always on (a free instance sleeps after 15 min idle); started through </w:t>
             </w:r>
             <w:r>
               <w:rPr>

</xml_diff>